<commit_message>
version final de dataset + EDA
</commit_message>
<xml_diff>
--- a/RAPPORT.docx
+++ b/RAPPORT.docx
@@ -2203,28 +2203,18 @@
     </w:p>
     <w:p>
       <w:pPr>
-        <w:spacing w:before="100" w:beforeAutospacing="1" w:after="100" w:afterAutospacing="1" w:line="240" w:lineRule="auto"/>
-        <w:rPr>
-          <w:rFonts w:ascii="Times New Roman" w:eastAsia="Times New Roman" w:hAnsi="Times New Roman" w:cs="Times New Roman"/>
-          <w:sz w:val="24"/>
-          <w:szCs w:val="24"/>
-          <w:lang w:eastAsia="fr-FR"/>
-        </w:rPr>
-      </w:pPr>
-      <w:r>
-        <w:rPr>
-          <w:rFonts w:ascii="Times New Roman" w:eastAsia="Times New Roman" w:hAnsi="Times New Roman" w:cs="Times New Roman"/>
+        <w:pStyle w:val="NormalWeb"/>
+      </w:pPr>
+      <w:r>
+        <w:rPr>
           <w:noProof/>
-          <w:sz w:val="24"/>
-          <w:szCs w:val="24"/>
-          <w:lang w:eastAsia="fr-FR"/>
         </w:rPr>
         <w:lastRenderedPageBreak/>
         <w:drawing>
           <wp:inline distT="0" distB="0" distL="0" distR="0">
-            <wp:extent cx="5994982" cy="4065905"/>
-            <wp:effectExtent l="0" t="0" r="6350" b="0"/>
-            <wp:docPr id="2" name="Image 2" descr="C:\Users\hp\AppData\Local\Packages\5319275A.WhatsAppDesktop_cv1g1gvanyjgm\LocalState\sessions\F986FC564A70273C3B2729F6E71EF39EDF534117\transfers\2026-18\WhatsApp Image 2026-04-29 at 21.28.49.jpeg"/>
+            <wp:extent cx="5915465" cy="4367530"/>
+            <wp:effectExtent l="0" t="0" r="9525" b="0"/>
+            <wp:docPr id="5" name="Image 5" descr="C:\Users\hp\Downloads\WhatsApp Image 2026-05-18 at 12.09.35.jpeg"/>
             <wp:cNvGraphicFramePr>
               <a:graphicFrameLocks xmlns:a="http://schemas.openxmlformats.org/drawingml/2006/main" noChangeAspect="1"/>
             </wp:cNvGraphicFramePr>
@@ -2232,7 +2222,7 @@
               <a:graphicData uri="http://schemas.openxmlformats.org/drawingml/2006/picture">
                 <pic:pic xmlns:pic="http://schemas.openxmlformats.org/drawingml/2006/picture">
                   <pic:nvPicPr>
-                    <pic:cNvPr id="0" name="Picture 11" descr="C:\Users\hp\AppData\Local\Packages\5319275A.WhatsAppDesktop_cv1g1gvanyjgm\LocalState\sessions\F986FC564A70273C3B2729F6E71EF39EDF534117\transfers\2026-18\WhatsApp Image 2026-04-29 at 21.28.49.jpeg"/>
+                    <pic:cNvPr id="0" name="Picture 10" descr="C:\Users\hp\Downloads\WhatsApp Image 2026-05-18 at 12.09.35.jpeg"/>
                     <pic:cNvPicPr>
                       <a:picLocks noChangeAspect="1" noChangeArrowheads="1"/>
                     </pic:cNvPicPr>
@@ -2253,7 +2243,7 @@
                   <pic:spPr bwMode="auto">
                     <a:xfrm>
                       <a:off x="0" y="0"/>
-                      <a:ext cx="5998047" cy="4067984"/>
+                      <a:ext cx="5934782" cy="4381793"/>
                     </a:xfrm>
                     <a:prstGeom prst="rect">
                       <a:avLst/>
@@ -2921,6 +2911,7 @@
           <w:szCs w:val="20"/>
           <w:lang w:eastAsia="fr-FR"/>
         </w:rPr>
+        <w:lastRenderedPageBreak/>
         <w:t>categorie</w:t>
       </w:r>
       <w:proofErr w:type="spellEnd"/>
@@ -2991,7 +2982,6 @@
           <w:szCs w:val="24"/>
           <w:lang w:eastAsia="fr-FR"/>
         </w:rPr>
-        <w:lastRenderedPageBreak/>
         <w:t>PHARMACIES</w:t>
       </w:r>
     </w:p>
@@ -4662,6 +4652,7 @@
           <w:szCs w:val="24"/>
           <w:lang w:eastAsia="fr-FR"/>
         </w:rPr>
+        <w:lastRenderedPageBreak/>
         <w:t>Variables temporelles</w:t>
       </w:r>
     </w:p>
@@ -4723,7 +4714,6 @@
           <w:szCs w:val="24"/>
           <w:lang w:eastAsia="fr-FR"/>
         </w:rPr>
-        <w:lastRenderedPageBreak/>
         <w:t>Saison</w:t>
       </w:r>
       <w:r>
@@ -5770,6 +5760,7 @@
           <w:szCs w:val="24"/>
           <w:lang w:eastAsia="fr-FR"/>
         </w:rPr>
+        <w:lastRenderedPageBreak/>
         <w:t>Intégration native Python</w:t>
       </w:r>
       <w:r>
@@ -5854,7 +5845,6 @@
           <w:szCs w:val="24"/>
           <w:lang w:eastAsia="fr-FR"/>
         </w:rPr>
-        <w:lastRenderedPageBreak/>
         <w:t>Limites assumées :</w:t>
       </w:r>
     </w:p>
@@ -6769,6 +6759,7 @@
           <w:szCs w:val="24"/>
           <w:lang w:eastAsia="fr-FR"/>
         </w:rPr>
+        <w:lastRenderedPageBreak/>
         <w:t>Référence médicaments (source : Ministère de la Santé) :</w:t>
       </w:r>
     </w:p>
@@ -6795,7 +6786,6 @@
           <w:szCs w:val="24"/>
           <w:lang w:eastAsia="fr-FR"/>
         </w:rPr>
-        <w:lastRenderedPageBreak/>
         <w:t>91,7% catégorie T1</w:t>
       </w:r>
       <w:r>
@@ -7889,6 +7879,7 @@
           </w:tcPr>
           <w:p>
             <w:r>
+              <w:lastRenderedPageBreak/>
               <w:t>Patients</w:t>
             </w:r>
           </w:p>
@@ -13884,6 +13875,23 @@
       </w:tblBorders>
     </w:tblPr>
   </w:style>
+  <w:style w:type="paragraph" w:styleId="NormalWeb">
+    <w:name w:val="Normal (Web)"/>
+    <w:basedOn w:val="Normal"/>
+    <w:uiPriority w:val="99"/>
+    <w:semiHidden/>
+    <w:unhideWhenUsed/>
+    <w:rsid w:val="000C13DF"/>
+    <w:pPr>
+      <w:spacing w:before="100" w:beforeAutospacing="1" w:after="100" w:afterAutospacing="1" w:line="240" w:lineRule="auto"/>
+    </w:pPr>
+    <w:rPr>
+      <w:rFonts w:ascii="Times New Roman" w:eastAsia="Times New Roman" w:hAnsi="Times New Roman" w:cs="Times New Roman"/>
+      <w:sz w:val="24"/>
+      <w:szCs w:val="24"/>
+      <w:lang w:eastAsia="fr-FR"/>
+    </w:rPr>
+  </w:style>
 </w:styles>
 </file>
 
@@ -14153,7 +14161,7 @@
 </file>
 
 <file path=customXml/itemProps1.xml><?xml version="1.0" encoding="utf-8"?>
-<ds:datastoreItem xmlns:ds="http://schemas.openxmlformats.org/officeDocument/2006/customXml" ds:itemID="{7912DE58-3740-4713-87AE-14B47CCC864B}">
+<ds:datastoreItem xmlns:ds="http://schemas.openxmlformats.org/officeDocument/2006/customXml" ds:itemID="{AAA30E3E-452B-41A6-AC26-78F0867294C4}">
   <ds:schemaRefs>
     <ds:schemaRef ds:uri="http://schemas.openxmlformats.org/officeDocument/2006/bibliography"/>
   </ds:schemaRefs>

</xml_diff>